<commit_message>
Fix Codex review findings: stale Fig. 3.5 reference and dangling PAGEREFs
- Section 3.10 still said "Figure 3.4 shows the resulting dependency..."
  for the module dependency graph after it was renumbered to Fig. 3.5
  during the supervisor-feedback pass; fix the inline reference.
- The CH1-CH3 milestone snapshots kept the full List of Tables/List of
  Figures even though most entries' tbl*/fig* bookmarks live in chapters
  truncated to placeholders in those snapshots, so refreshing fields in
  Word would show blank/broken references. Trim each snapshot's lists to
  only the entries whose chapter is actually complete at that milestone
  (CH1/CH2: none yet, noted as such; CH3: Chapter Three's tables/figures
  only). CH4/CH5/FINAL already had every entry, so they're unaffected in
  content beyond the Fig. 3.5 text fix.

Co-Authored-By: Claude Sonnet 5 <noreply@anthropic.com>
Claude-Session: https://claude.ai/code/session_01TaquqCcFoEwgGj6GkMMNgr
</commit_message>
<xml_diff>
--- a/docs/PROJECT_SUBMISSION_CH1.docx
+++ b/docs/PROJECT_SUBMISSION_CH1.docx
@@ -734,128 +734,18 @@
     </w:p>
     <w:p>
       <w:pPr>
-        <w:tabs>
-          <w:tab w:val="right" w:pos="9026" w:leader="dot"/>
-        </w:tabs>
-        <w:spacing w:after="160" w:line="360" w:lineRule="auto"/>
-      </w:pPr>
-      <w:r>
-        <w:rPr>
-          <w:rFonts w:ascii="Times New Roman" w:cs="Times New Roman" w:eastAsia="Times New Roman" w:hAnsi="Times New Roman"/>
-          <w:sz w:val="24"/>
-          <w:szCs w:val="24"/>
-        </w:rPr>
-        <w:t xml:space="preserve">Table 3.1: Transformer Encoder model hyperparameters	</w:t>
-      </w:r>
-      <w:r>
-        <w:fldChar w:fldCharType="begin" w:dirty="true"/>
-        <w:instrText xml:space="preserve">PAGEREF tbl3_1</w:instrText>
-        <w:fldChar w:fldCharType="end"/>
-      </w:r>
-    </w:p>
-    <w:p>
-      <w:pPr>
-        <w:tabs>
-          <w:tab w:val="right" w:pos="9026" w:leader="dot"/>
-        </w:tabs>
-        <w:spacing w:after="160" w:line="360" w:lineRule="auto"/>
-      </w:pPr>
-      <w:r>
-        <w:rPr>
-          <w:rFonts w:ascii="Times New Roman" w:cs="Times New Roman" w:eastAsia="Times New Roman" w:hAnsi="Times New Roman"/>
-          <w:sz w:val="24"/>
-          <w:szCs w:val="24"/>
-        </w:rPr>
-        <w:t xml:space="preserve">Table 3.2: Scheduler safety-rule thresholds	</w:t>
-      </w:r>
-      <w:r>
-        <w:fldChar w:fldCharType="begin" w:dirty="true"/>
-        <w:instrText xml:space="preserve">PAGEREF tbl3_2</w:instrText>
-        <w:fldChar w:fldCharType="end"/>
-      </w:r>
-    </w:p>
-    <w:p>
-      <w:pPr>
-        <w:tabs>
-          <w:tab w:val="right" w:pos="9026" w:leader="dot"/>
-        </w:tabs>
-        <w:spacing w:after="160" w:line="360" w:lineRule="auto"/>
-      </w:pPr>
-      <w:r>
-        <w:rPr>
-          <w:rFonts w:ascii="Times New Roman" w:cs="Times New Roman" w:eastAsia="Times New Roman" w:hAnsi="Times New Roman"/>
-          <w:sz w:val="24"/>
-          <w:szCs w:val="24"/>
-        </w:rPr>
-        <w:t xml:space="preserve">Table 4.1: Fitted Poisson arrival-rate parameters by direction and period	</w:t>
-      </w:r>
-      <w:r>
-        <w:fldChar w:fldCharType="begin" w:dirty="true"/>
-        <w:instrText xml:space="preserve">PAGEREF tbl4_1</w:instrText>
-        <w:fldChar w:fldCharType="end"/>
-      </w:r>
-    </w:p>
-    <w:p>
-      <w:pPr>
-        <w:tabs>
-          <w:tab w:val="right" w:pos="9026" w:leader="dot"/>
-        </w:tabs>
-        <w:spacing w:after="160" w:line="360" w:lineRule="auto"/>
-      </w:pPr>
-      <w:r>
-        <w:rPr>
-          <w:rFonts w:ascii="Times New Roman" w:cs="Times New Roman" w:eastAsia="Times New Roman" w:hAnsi="Times New Roman"/>
-          <w:sz w:val="24"/>
-          <w:szCs w:val="24"/>
-        </w:rPr>
-        <w:t xml:space="preserve">Table 4.2: Transformer Encoder training result	</w:t>
-      </w:r>
-      <w:r>
-        <w:fldChar w:fldCharType="begin" w:dirty="true"/>
-        <w:instrText xml:space="preserve">PAGEREF tbl4_2</w:instrText>
-        <w:fldChar w:fldCharType="end"/>
-      </w:r>
-    </w:p>
-    <w:p>
-      <w:pPr>
-        <w:tabs>
-          <w:tab w:val="right" w:pos="9026" w:leader="dot"/>
-        </w:tabs>
-        <w:spacing w:after="160" w:line="360" w:lineRule="auto"/>
-      </w:pPr>
-      <w:r>
-        <w:rPr>
-          <w:rFonts w:ascii="Times New Roman" w:cs="Times New Roman" w:eastAsia="Times New Roman" w:hAnsi="Times New Roman"/>
-          <w:sz w:val="24"/>
-          <w:szCs w:val="24"/>
-        </w:rPr>
-        <w:t xml:space="preserve">Table 4.3: Intelligent controller vs. fixed-time baseline — Sapon Under-bridge Peak Hour scenario	</w:t>
-      </w:r>
-      <w:r>
-        <w:fldChar w:fldCharType="begin" w:dirty="true"/>
-        <w:instrText xml:space="preserve">PAGEREF tbl4_3</w:instrText>
-        <w:fldChar w:fldCharType="end"/>
-      </w:r>
-    </w:p>
-    <w:p>
-      <w:pPr>
-        <w:tabs>
-          <w:tab w:val="right" w:pos="9026" w:leader="dot"/>
-        </w:tabs>
-        <w:spacing w:after="160" w:line="360" w:lineRule="auto"/>
-      </w:pPr>
-      <w:r>
-        <w:rPr>
-          <w:rFonts w:ascii="Times New Roman" w:cs="Times New Roman" w:eastAsia="Times New Roman" w:hAnsi="Times New Roman"/>
-          <w:sz w:val="24"/>
-          <w:szCs w:val="24"/>
-        </w:rPr>
-        <w:t xml:space="preserve">Table 4.4: Intelligent controller vs. fixed-time baseline — Sapon Under-bridge Off-Peak scenario	</w:t>
-      </w:r>
-      <w:r>
-        <w:fldChar w:fldCharType="begin" w:dirty="true"/>
-        <w:instrText xml:space="preserve">PAGEREF tbl4_4</w:instrText>
-        <w:fldChar w:fldCharType="end"/>
+        <w:spacing w:after="240" w:line="480" w:lineRule="auto"/>
+        <w:jc w:val="center"/>
+      </w:pPr>
+      <w:r>
+        <w:rPr>
+          <w:rFonts w:ascii="Times New Roman" w:cs="Times New Roman" w:eastAsia="Times New Roman" w:hAnsi="Times New Roman"/>
+          <w:i/>
+          <w:iCs/>
+          <w:sz w:val="24"/>
+          <w:szCs w:val="24"/>
+        </w:rPr>
+        <w:t xml:space="preserve">None yet at this milestone.</w:t>
       </w:r>
     </w:p>
     <w:p>
@@ -881,191 +771,18 @@
     </w:p>
     <w:p>
       <w:pPr>
-        <w:tabs>
-          <w:tab w:val="right" w:pos="9026" w:leader="dot"/>
-        </w:tabs>
-        <w:spacing w:after="160" w:line="360" w:lineRule="auto"/>
-      </w:pPr>
-      <w:r>
-        <w:rPr>
-          <w:rFonts w:ascii="Times New Roman" w:cs="Times New Roman" w:eastAsia="Times New Roman" w:hAnsi="Times New Roman"/>
-          <w:sz w:val="24"/>
-          <w:szCs w:val="24"/>
-        </w:rPr>
-        <w:t xml:space="preserve">Fig. 3.1: MaHanya system architecture and process boundaries	</w:t>
-      </w:r>
-      <w:r>
-        <w:fldChar w:fldCharType="begin" w:dirty="true"/>
-        <w:instrText xml:space="preserve">PAGEREF fig3_1</w:instrText>
-        <w:fldChar w:fldCharType="end"/>
-      </w:r>
-    </w:p>
-    <w:p>
-      <w:pPr>
-        <w:tabs>
-          <w:tab w:val="right" w:pos="9026" w:leader="dot"/>
-        </w:tabs>
-        <w:spacing w:after="160" w:line="360" w:lineRule="auto"/>
-      </w:pPr>
-      <w:r>
-        <w:rPr>
-          <w:rFonts w:ascii="Times New Roman" w:cs="Times New Roman" w:eastAsia="Times New Roman" w:hAnsi="Times New Roman"/>
-          <w:sz w:val="24"/>
-          <w:szCs w:val="24"/>
-        </w:rPr>
-        <w:t xml:space="preserve">Fig. 3.2: MaHanya use case diagram	</w:t>
-      </w:r>
-      <w:r>
-        <w:fldChar w:fldCharType="begin" w:dirty="true"/>
-        <w:instrText xml:space="preserve">PAGEREF fig3_2</w:instrText>
-        <w:fldChar w:fldCharType="end"/>
-      </w:r>
-    </w:p>
-    <w:p>
-      <w:pPr>
-        <w:tabs>
-          <w:tab w:val="right" w:pos="9026" w:leader="dot"/>
-        </w:tabs>
-        <w:spacing w:after="160" w:line="360" w:lineRule="auto"/>
-      </w:pPr>
-      <w:r>
-        <w:rPr>
-          <w:rFonts w:ascii="Times New Roman" w:cs="Times New Roman" w:eastAsia="Times New Roman" w:hAnsi="Times New Roman"/>
-          <w:sz w:val="24"/>
-          <w:szCs w:val="24"/>
-        </w:rPr>
-        <w:t xml:space="preserve">Fig. 3.3: Runtime control-loop detail (observe, predict/pre-empt, validate, apply, log)	</w:t>
-      </w:r>
-      <w:r>
-        <w:fldChar w:fldCharType="begin" w:dirty="true"/>
-        <w:instrText xml:space="preserve">PAGEREF fig3_3</w:instrText>
-        <w:fldChar w:fldCharType="end"/>
-      </w:r>
-    </w:p>
-    <w:p>
-      <w:pPr>
-        <w:tabs>
-          <w:tab w:val="right" w:pos="9026" w:leader="dot"/>
-        </w:tabs>
-        <w:spacing w:after="160" w:line="360" w:lineRule="auto"/>
-      </w:pPr>
-      <w:r>
-        <w:rPr>
-          <w:rFonts w:ascii="Times New Roman" w:cs="Times New Roman" w:eastAsia="Times New Roman" w:hAnsi="Times New Roman"/>
-          <w:sz w:val="24"/>
-          <w:szCs w:val="24"/>
-        </w:rPr>
-        <w:t xml:space="preserve">Fig. 3.4: End-to-end pipeline, from field data collection to the dashboard	</w:t>
-      </w:r>
-      <w:r>
-        <w:fldChar w:fldCharType="begin" w:dirty="true"/>
-        <w:instrText xml:space="preserve">PAGEREF fig3_4</w:instrText>
-        <w:fldChar w:fldCharType="end"/>
-      </w:r>
-    </w:p>
-    <w:p>
-      <w:pPr>
-        <w:tabs>
-          <w:tab w:val="right" w:pos="9026" w:leader="dot"/>
-        </w:tabs>
-        <w:spacing w:after="160" w:line="360" w:lineRule="auto"/>
-      </w:pPr>
-      <w:r>
-        <w:rPr>
-          <w:rFonts w:ascii="Times New Roman" w:cs="Times New Roman" w:eastAsia="Times New Roman" w:hAnsi="Times New Roman"/>
-          <w:sz w:val="24"/>
-          <w:szCs w:val="24"/>
-        </w:rPr>
-        <w:t xml:space="preserve">Fig. 3.5: mahanya module dependency graph	</w:t>
-      </w:r>
-      <w:r>
-        <w:fldChar w:fldCharType="begin" w:dirty="true"/>
-        <w:instrText xml:space="preserve">PAGEREF fig3_5</w:instrText>
-        <w:fldChar w:fldCharType="end"/>
-      </w:r>
-    </w:p>
-    <w:p>
-      <w:pPr>
-        <w:tabs>
-          <w:tab w:val="right" w:pos="9026" w:leader="dot"/>
-        </w:tabs>
-        <w:spacing w:after="160" w:line="360" w:lineRule="auto"/>
-      </w:pPr>
-      <w:r>
-        <w:rPr>
-          <w:rFonts w:ascii="Times New Roman" w:cs="Times New Roman" w:eastAsia="Times New Roman" w:hAnsi="Times New Roman"/>
-          <w:sz w:val="24"/>
-          <w:szCs w:val="24"/>
-        </w:rPr>
-        <w:t xml:space="preserve">Fig. 4.1: Live Junction dashboard during a live emergency-vehicle pre-emption event	</w:t>
-      </w:r>
-      <w:r>
-        <w:fldChar w:fldCharType="begin" w:dirty="true"/>
-        <w:instrText xml:space="preserve">PAGEREF fig4_1</w:instrText>
-        <w:fldChar w:fldCharType="end"/>
-      </w:r>
-    </w:p>
-    <w:p>
-      <w:pPr>
-        <w:tabs>
-          <w:tab w:val="right" w:pos="9026" w:leader="dot"/>
-        </w:tabs>
-        <w:spacing w:after="160" w:line="360" w:lineRule="auto"/>
-      </w:pPr>
-      <w:r>
-        <w:rPr>
-          <w:rFonts w:ascii="Times New Roman" w:cs="Times New Roman" w:eastAsia="Times New Roman" w:hAnsi="Times New Roman"/>
-          <w:sz w:val="24"/>
-          <w:szCs w:val="24"/>
-        </w:rPr>
-        <w:t xml:space="preserve">Fig. 4.2: Live Junction dashboard zoomed in on individual vehicles and per-lane signals	</w:t>
-      </w:r>
-      <w:r>
-        <w:fldChar w:fldCharType="begin" w:dirty="true"/>
-        <w:instrText xml:space="preserve">PAGEREF fig4_2</w:instrText>
-        <w:fldChar w:fldCharType="end"/>
-      </w:r>
-    </w:p>
-    <w:p>
-      <w:pPr>
-        <w:tabs>
-          <w:tab w:val="right" w:pos="9026" w:leader="dot"/>
-        </w:tabs>
-        <w:spacing w:after="160" w:line="360" w:lineRule="auto"/>
-      </w:pPr>
-      <w:r>
-        <w:rPr>
-          <w:rFonts w:ascii="Times New Roman" w:cs="Times New Roman" w:eastAsia="Times New Roman" w:hAnsi="Times New Roman"/>
-          <w:sz w:val="24"/>
-          <w:szCs w:val="24"/>
-        </w:rPr>
-        <w:t xml:space="preserve">Fig. 4.3: Decision Log page, listing scheduler decisions with their reason codes	</w:t>
-      </w:r>
-      <w:r>
-        <w:fldChar w:fldCharType="begin" w:dirty="true"/>
-        <w:instrText xml:space="preserve">PAGEREF fig4_3</w:instrText>
-        <w:fldChar w:fldCharType="end"/>
-      </w:r>
-    </w:p>
-    <w:p>
-      <w:pPr>
-        <w:tabs>
-          <w:tab w:val="right" w:pos="9026" w:leader="dot"/>
-        </w:tabs>
-        <w:spacing w:after="160" w:line="360" w:lineRule="auto"/>
-      </w:pPr>
-      <w:r>
-        <w:rPr>
-          <w:rFonts w:ascii="Times New Roman" w:cs="Times New Roman" w:eastAsia="Times New Roman" w:hAnsi="Times New Roman"/>
-          <w:sz w:val="24"/>
-          <w:szCs w:val="24"/>
-        </w:rPr>
-        <w:t xml:space="preserve">Fig. 4.4: Evaluation page comparing the intelligent controller against the fixed-time baseline	</w:t>
-      </w:r>
-      <w:r>
-        <w:fldChar w:fldCharType="begin" w:dirty="true"/>
-        <w:instrText xml:space="preserve">PAGEREF fig4_4</w:instrText>
-        <w:fldChar w:fldCharType="end"/>
+        <w:spacing w:after="240" w:line="480" w:lineRule="auto"/>
+        <w:jc w:val="center"/>
+      </w:pPr>
+      <w:r>
+        <w:rPr>
+          <w:rFonts w:ascii="Times New Roman" w:cs="Times New Roman" w:eastAsia="Times New Roman" w:hAnsi="Times New Roman"/>
+          <w:i/>
+          <w:iCs/>
+          <w:sz w:val="24"/>
+          <w:szCs w:val="24"/>
+        </w:rPr>
+        <w:t xml:space="preserve">None yet at this milestone.</w:t>
       </w:r>
     </w:p>
     <w:p>

</xml_diff>

<commit_message>
Remove List of Tables / List of Figures front matter
Not required by Project_Writing_Guideline.md (it only names the Table of
Contents explicitly), and dropping it also removes the class of dangling
PAGEREF issue the milestone snapshots ran into. Applied to FINAL and
regenerated CH1-CH5 from it.

Co-Authored-By: Claude Sonnet 5 <noreply@anthropic.com>
Claude-Session: https://claude.ai/code/session_01TaquqCcFoEwgGj6GkMMNgr
</commit_message>
<xml_diff>
--- a/docs/PROJECT_SUBMISSION_CH1.docx
+++ b/docs/PROJECT_SUBMISSION_CH1.docx
@@ -711,80 +711,6 @@
         </w:p>
       </w:sdtContent>
     </w:sdt>
-    <w:p>
-      <w:r>
-        <w:br w:type="page"/>
-      </w:r>
-    </w:p>
-    <w:p>
-      <w:pPr>
-        <w:spacing w:after="320" w:before="0" w:line="360" w:lineRule="auto"/>
-        <w:jc w:val="center"/>
-      </w:pPr>
-      <w:r>
-        <w:rPr>
-          <w:rFonts w:ascii="Times New Roman" w:cs="Times New Roman" w:eastAsia="Times New Roman" w:hAnsi="Times New Roman"/>
-          <w:b/>
-          <w:bCs/>
-          <w:sz w:val="28"/>
-          <w:szCs w:val="28"/>
-        </w:rPr>
-        <w:t xml:space="preserve">LIST OF TABLES</w:t>
-      </w:r>
-    </w:p>
-    <w:p>
-      <w:pPr>
-        <w:spacing w:after="240" w:line="480" w:lineRule="auto"/>
-        <w:jc w:val="center"/>
-      </w:pPr>
-      <w:r>
-        <w:rPr>
-          <w:rFonts w:ascii="Times New Roman" w:cs="Times New Roman" w:eastAsia="Times New Roman" w:hAnsi="Times New Roman"/>
-          <w:i/>
-          <w:iCs/>
-          <w:sz w:val="24"/>
-          <w:szCs w:val="24"/>
-        </w:rPr>
-        <w:t xml:space="preserve">None yet at this milestone.</w:t>
-      </w:r>
-    </w:p>
-    <w:p>
-      <w:r>
-        <w:br w:type="page"/>
-      </w:r>
-    </w:p>
-    <w:p>
-      <w:pPr>
-        <w:spacing w:after="320" w:before="0" w:line="360" w:lineRule="auto"/>
-        <w:jc w:val="center"/>
-      </w:pPr>
-      <w:r>
-        <w:rPr>
-          <w:rFonts w:ascii="Times New Roman" w:cs="Times New Roman" w:eastAsia="Times New Roman" w:hAnsi="Times New Roman"/>
-          <w:b/>
-          <w:bCs/>
-          <w:sz w:val="28"/>
-          <w:szCs w:val="28"/>
-        </w:rPr>
-        <w:t xml:space="preserve">LIST OF FIGURES</w:t>
-      </w:r>
-    </w:p>
-    <w:p>
-      <w:pPr>
-        <w:spacing w:after="240" w:line="480" w:lineRule="auto"/>
-        <w:jc w:val="center"/>
-      </w:pPr>
-      <w:r>
-        <w:rPr>
-          <w:rFonts w:ascii="Times New Roman" w:cs="Times New Roman" w:eastAsia="Times New Roman" w:hAnsi="Times New Roman"/>
-          <w:i/>
-          <w:iCs/>
-          <w:sz w:val="24"/>
-          <w:szCs w:val="24"/>
-        </w:rPr>
-        <w:t xml:space="preserve">None yet at this milestone.</w:t>
-      </w:r>
-    </w:p>
     <w:p>
       <w:r>
         <w:br w:type="page"/>

</xml_diff>

<commit_message>
Remove em/en dashes from the project submission docx files
Replace em dashes (—) and en dashes (–) inside the Word document
text runs (chapters 1-5 and the FINAL submission doc, which mirrors
CH5) with plain ASCII punctuation, matching the same convention
already applied to the docs/code in the prior pass. Citation page
ranges and glossary/abbreviation separators use hyphens or colons;
parenthetical asides use commas, semicolons, colons, or parentheses
depending on the surrounding grammar.

No wording changes beyond punctuation. Verified with the docx skill's
XSD schema validator against each original file (paragraph counts
unchanged, all validations passed).

Co-Authored-By: Claude Sonnet 5 <noreply@anthropic.com>
Claude-Session: https://claude.ai/code/session_01WKAwX9XjmoDaKHKcERrDqf
</commit_message>
<xml_diff>
--- a/docs/PROJECT_SUBMISSION_CH1.docx
+++ b/docs/PROJECT_SUBMISSION_CH1.docx
@@ -624,35 +624,35 @@
           <w:sz w:val="24"/>
           <w:szCs w:val="24"/>
         </w:rPr>
-        <w:t xml:space="preserve">Fixed-time traffic signal systems allocate green time on a predetermined schedule regardless of real-time demand, producing unnecessary delay at unevenly loaded junctions and providing no systematic mechanism for prioritising emergency vehicles. This project, named MaHanya, designs and implements a simulation-based, priority-aware intelligent traffic control system for a real four-way junction — the Sapon Under-bridge Junction, Abeokuta — using microscopic traffic simulation, a learned phase-recommendation model, and a deterministic safety scheduler that has the sole authority to decide what signal state is actually applied.</w:t>
-      </w:r>
-    </w:p>
-    <w:p>
-      <w:pPr>
-        <w:spacing w:after="240" w:line="480" w:lineRule="auto"/>
-        <w:jc w:val="both"/>
-      </w:pPr>
-      <w:r>
-        <w:rPr>
-          <w:rFonts w:ascii="Times New Roman" w:cs="Times New Roman" w:eastAsia="Times New Roman" w:hAnsi="Times New Roman"/>
-          <w:sz w:val="24"/>
-          <w:szCs w:val="24"/>
-        </w:rPr>
-        <w:t xml:space="preserve">Vehicle-arrival counts collected across the junction's four approaches, for peak and off-peak periods, were fitted to Poisson arrival distributions using scipy.stats and used to calibrate a multi-phase microscopic simulation of the junction in SUMO (Simulation of Urban MObility), built with netedit and driven at runtime through the TraCI control interface. Time-series traffic-state sequences generated from the calibrated simulation were used to train a lightweight Transformer Encoder, implemented in PyTorch, that recommends a signal phase from a sixteen-tick window of observed traffic state. A deterministic rule-based scheduler validates every recommendation the model produces against operational safety constraints — minimum and maximum green time, yellow and all-red transition intervals, anti-starvation, and emergency-vehicle pre-emption — before any phase change is applied, and logs every decision with an explicit, auditable reason code. A Next.js single-page dashboard, talking only to an internal FastAPI relay, renders the live junction, the active signal phase, priority events, and the model's recommendation alongside the scheduler's actual decision in real time.</w:t>
-      </w:r>
-    </w:p>
-    <w:p>
-      <w:pPr>
-        <w:spacing w:after="240" w:line="480" w:lineRule="auto"/>
-        <w:jc w:val="both"/>
-      </w:pPr>
-      <w:r>
-        <w:rPr>
-          <w:rFonts w:ascii="Times New Roman" w:cs="Times New Roman" w:eastAsia="Times New Roman" w:hAnsi="Times New Roman"/>
-          <w:sz w:val="24"/>
-          <w:szCs w:val="24"/>
-        </w:rPr>
-        <w:t xml:space="preserve">The trained model reached 91.9% validation accuracy in recommending the scheduler's own logged phase decisions. Evaluated head-to-head against a fixed-time baseline on identical fifteen-minute simulation runs of the calibrated peak-hour scenario, the intelligent controller reduced priority-vehicle response time by 44.5% (23.9s versus 43.0s) at a small cost in average waiting time (23.8s versus 22.3s) and throughput (380 versus 384 vehicles per hour); the off-peak scenario showed the same pattern, with a 43.2% improvement in priority response time. These results demonstrate that a learned recommender constrained by a deterministic, exhaustively-testable safety layer can materially improve the safety-critical objective of the system — getting emergency vehicles through the junction faster — without violating any hard operational constraint, while identifying average-case throughput as an area for future tuning.</w:t>
+        <w:t xml:space="preserve">Fixed-time traffic signal systems allocate green time on a predetermined schedule regardless of real-time demand, producing unnecessary delay at unevenly loaded junctions and providing no systematic mechanism for prioritising emergency vehicles. This project, named MaHanya, designs and implements a simulation-based, priority-aware intelligent traffic control system for a real four-way junction, the Sapon Under-bridge Junction, Abeokuta, using microscopic traffic simulation, a learned phase-recommendation model, and a deterministic safety scheduler that has the sole authority to decide what signal state is actually applied.</w:t>
+      </w:r>
+    </w:p>
+    <w:p>
+      <w:pPr>
+        <w:spacing w:after="240" w:line="480" w:lineRule="auto"/>
+        <w:jc w:val="both"/>
+      </w:pPr>
+      <w:r>
+        <w:rPr>
+          <w:rFonts w:ascii="Times New Roman" w:cs="Times New Roman" w:eastAsia="Times New Roman" w:hAnsi="Times New Roman"/>
+          <w:sz w:val="24"/>
+          <w:szCs w:val="24"/>
+        </w:rPr>
+        <w:t xml:space="preserve">Vehicle-arrival counts collected across the junction's four approaches, for peak and off-peak periods, were fitted to Poisson arrival distributions using scipy.stats and used to calibrate a multi-phase microscopic simulation of the junction in SUMO (Simulation of Urban MObility), built with netedit and driven at runtime through the TraCI control interface. Time-series traffic-state sequences generated from the calibrated simulation were used to train a lightweight Transformer Encoder, implemented in PyTorch, that recommends a signal phase from a sixteen-tick window of observed traffic state. A deterministic rule-based scheduler validates every recommendation the model produces against operational safety constraints (minimum and maximum green time, yellow and all-red transition intervals, anti-starvation, and emergency-vehicle pre-emption) before any phase change is applied, and logs every decision with an explicit, auditable reason code. A Next.js single-page dashboard, talking only to an internal FastAPI relay, renders the live junction, the active signal phase, priority events, and the model's recommendation alongside the scheduler's actual decision in real time.</w:t>
+      </w:r>
+    </w:p>
+    <w:p>
+      <w:pPr>
+        <w:spacing w:after="240" w:line="480" w:lineRule="auto"/>
+        <w:jc w:val="both"/>
+      </w:pPr>
+      <w:r>
+        <w:rPr>
+          <w:rFonts w:ascii="Times New Roman" w:cs="Times New Roman" w:eastAsia="Times New Roman" w:hAnsi="Times New Roman"/>
+          <w:sz w:val="24"/>
+          <w:szCs w:val="24"/>
+        </w:rPr>
+        <w:t xml:space="preserve">The trained model reached 91.9% validation accuracy in recommending the scheduler's own logged phase decisions. Evaluated head-to-head against a fixed-time baseline on identical fifteen-minute simulation runs of the calibrated peak-hour scenario, the intelligent controller reduced priority-vehicle response time by 44.5% (23.9s versus 43.0s) at a small cost in average waiting time (23.8s versus 22.3s) and throughput (380 versus 384 vehicles per hour); the off-peak scenario showed the same pattern, with a 43.2% improvement in priority response time. These results demonstrate that a learned recommender constrained by a deterministic, exhaustively-testable safety layer can materially improve the safety-critical objective of the system (getting emergency vehicles through the junction faster) without violating any hard operational constraint, while identifying average-case throughput as an area for future tuning.</w:t>
       </w:r>
     </w:p>
     <w:p>
@@ -829,7 +829,7 @@
           <w:sz w:val="24"/>
           <w:szCs w:val="24"/>
         </w:rPr>
-        <w:t xml:space="preserve">	— Application Programming Interface</w:t>
+        <w:t xml:space="preserve">	- Application Programming Interface</w:t>
       </w:r>
     </w:p>
     <w:p>
@@ -855,7 +855,7 @@
           <w:sz w:val="24"/>
           <w:szCs w:val="24"/>
         </w:rPr>
-        <w:t xml:space="preserve">	— Command-Line Interface</w:t>
+        <w:t xml:space="preserve">	- Command-Line Interface</w:t>
       </w:r>
     </w:p>
     <w:p>
@@ -881,7 +881,7 @@
           <w:sz w:val="24"/>
           <w:szCs w:val="24"/>
         </w:rPr>
-        <w:t xml:space="preserve">	— Comma-Separated Values</w:t>
+        <w:t xml:space="preserve">	- Comma-Separated Values</w:t>
       </w:r>
     </w:p>
     <w:p>
@@ -907,7 +907,7 @@
           <w:sz w:val="24"/>
           <w:szCs w:val="24"/>
         </w:rPr>
-        <w:t xml:space="preserve">	— A Python web framework used for the internal simulation relay</w:t>
+        <w:t xml:space="preserve">	- A Python web framework used for the internal simulation relay</w:t>
       </w:r>
     </w:p>
     <w:p>
@@ -933,7 +933,7 @@
           <w:sz w:val="24"/>
           <w:szCs w:val="24"/>
         </w:rPr>
-        <w:t xml:space="preserve">	— JavaScript Object Notation</w:t>
+        <w:t xml:space="preserve">	- JavaScript Object Notation</w:t>
       </w:r>
     </w:p>
     <w:p>
@@ -959,7 +959,7 @@
           <w:sz w:val="24"/>
           <w:szCs w:val="24"/>
         </w:rPr>
-        <w:t xml:space="preserve">	— The name of the system described in this project</w:t>
+        <w:t xml:space="preserve">	- The name of the system described in this project</w:t>
       </w:r>
     </w:p>
     <w:p>
@@ -985,7 +985,7 @@
           <w:sz w:val="24"/>
           <w:szCs w:val="24"/>
         </w:rPr>
-        <w:t xml:space="preserve">	— An open-source machine learning framework used to implement the model</w:t>
+        <w:t xml:space="preserve">	- An open-source machine learning framework used to implement the model</w:t>
       </w:r>
     </w:p>
     <w:p>
@@ -1011,7 +1011,7 @@
           <w:sz w:val="24"/>
           <w:szCs w:val="24"/>
         </w:rPr>
-        <w:t xml:space="preserve">	— Single-Page Application</w:t>
+        <w:t xml:space="preserve">	- Single-Page Application</w:t>
       </w:r>
     </w:p>
     <w:p>
@@ -1037,7 +1037,7 @@
           <w:sz w:val="24"/>
           <w:szCs w:val="24"/>
         </w:rPr>
-        <w:t xml:space="preserve">	— Server-Sent Events</w:t>
+        <w:t xml:space="preserve">	- Server-Sent Events</w:t>
       </w:r>
     </w:p>
     <w:p>
@@ -1063,7 +1063,7 @@
           <w:sz w:val="24"/>
           <w:szCs w:val="24"/>
         </w:rPr>
-        <w:t xml:space="preserve">	— Simulation of Urban MObility</w:t>
+        <w:t xml:space="preserve">	- Simulation of Urban MObility</w:t>
       </w:r>
     </w:p>
     <w:p>
@@ -1089,7 +1089,7 @@
           <w:sz w:val="24"/>
           <w:szCs w:val="24"/>
         </w:rPr>
-        <w:t xml:space="preserve">	— Traffic Control Interface (SUMO's runtime control API)</w:t>
+        <w:t xml:space="preserve">	- Traffic Control Interface (SUMO's runtime control API)</w:t>
       </w:r>
     </w:p>
     <w:p>
@@ -1115,7 +1115,7 @@
           <w:sz w:val="24"/>
           <w:szCs w:val="24"/>
         </w:rPr>
-        <w:t xml:space="preserve">	— User Interface</w:t>
+        <w:t xml:space="preserve">	- User Interface</w:t>
       </w:r>
     </w:p>
     <w:p>
@@ -1141,7 +1141,7 @@
           <w:sz w:val="24"/>
           <w:szCs w:val="24"/>
         </w:rPr>
-        <w:t xml:space="preserve">	— WebSocket</w:t>
+        <w:t xml:space="preserve">	- WebSocket</w:t>
       </w:r>
     </w:p>
     <w:p>
@@ -1233,35 +1233,35 @@
           <w:sz w:val="24"/>
           <w:szCs w:val="24"/>
         </w:rPr>
-        <w:t xml:space="preserve">The earliest departure from fixed-time control was traffic-responsive systems such as SCOOT (Split Cycle Offset Optimisation Technique), which uses real-time detector data to continuously adjust cycle length, phase splits, and offsets, and has been shown to reduce delay by roughly 15% relative to fixed timing (Hunt et al., 1982). More recently, the rise of deep learning has produced a wave of research applying reinforcement learning and, increasingly, attention-based sequence models to the same problem — learning a control policy directly from traffic-state observations rather than hand-tuning detector thresholds (Abdulhai et al., 2003; Haydari &amp; Yilmaz, 2020; Zhao et al., 2024). The Transformer architecture in particular, originally developed for natural language sequence modelling (Vaswani et al., 2017), has been shown to be well suited to traffic-state sequences because a junction's short-term traffic pattern is itself a sequence — a window of recent per-direction counts, queue lengths, and phase history — from which a plausible next phase can be inferred much as a language model infers a plausible next word.</w:t>
-      </w:r>
-    </w:p>
-    <w:p>
-      <w:pPr>
-        <w:spacing w:after="240" w:line="480" w:lineRule="auto"/>
-        <w:jc w:val="both"/>
-      </w:pPr>
-      <w:r>
-        <w:rPr>
-          <w:rFonts w:ascii="Times New Roman" w:cs="Times New Roman" w:eastAsia="Times New Roman" w:hAnsi="Times New Roman"/>
-          <w:sz w:val="24"/>
-          <w:szCs w:val="24"/>
-        </w:rPr>
-        <w:t xml:space="preserve">A purely learned controller is, however, difficult to trust with a safety-critical function such as a traffic signal: a neural network can produce a confident, well-formed, and completely unsafe recommendation — for example, a phase change that skips a mandatory clearance interval, or a hold that starves an approach indefinitely — and nothing in its own training process guarantees that this will never happen. This project's central design decision, discussed throughout this report, is therefore to treat any learned component as advisory only, and to place a small, deterministic, exhaustively-testable rule engine between the model's output and the physical (in this case, simulated) signal head, so that the system's safety properties do not depend on the model behaving correctly.</w:t>
-      </w:r>
-    </w:p>
-    <w:p>
-      <w:pPr>
-        <w:spacing w:after="240" w:line="480" w:lineRule="auto"/>
-        <w:jc w:val="both"/>
-      </w:pPr>
-      <w:r>
-        <w:rPr>
-          <w:rFonts w:ascii="Times New Roman" w:cs="Times New Roman" w:eastAsia="Times New Roman" w:hAnsi="Times New Roman"/>
-          <w:sz w:val="24"/>
-          <w:szCs w:val="24"/>
-        </w:rPr>
-        <w:t xml:space="preserve">This project, named MaHanya, applies this design to a real Nigerian junction — the Sapon Under-bridge Junction in Abeokuta, Ogun State — using it as a calibration case study for a simulation-based intelligent traffic control system built from a microscopic SUMO (Simulation of Urban MObility) simulation, a lightweight Transformer Encoder phase-recommendation model, and a deterministic priority-aware scheduler.</w:t>
+        <w:t xml:space="preserve">The earliest departure from fixed-time control was traffic-responsive systems such as SCOOT (Split Cycle Offset Optimisation Technique), which uses real-time detector data to continuously adjust cycle length, phase splits, and offsets, and has been shown to reduce delay by roughly 15% relative to fixed timing (Hunt et al., 1982). More recently, the rise of deep learning has produced a wave of research applying reinforcement learning and, increasingly, attention-based sequence models to the same problem, learning a control policy directly from traffic-state observations rather than hand-tuning detector thresholds (Abdulhai et al., 2003; Haydari &amp; Yilmaz, 2020; Zhao et al., 2024). The Transformer architecture in particular, originally developed for natural language sequence modelling (Vaswani et al., 2017), has been shown to be well suited to traffic-state sequences because a junction's short-term traffic pattern is itself a sequence (a window of recent per-direction counts, queue lengths, and phase history) from which a plausible next phase can be inferred much as a language model infers a plausible next word.</w:t>
+      </w:r>
+    </w:p>
+    <w:p>
+      <w:pPr>
+        <w:spacing w:after="240" w:line="480" w:lineRule="auto"/>
+        <w:jc w:val="both"/>
+      </w:pPr>
+      <w:r>
+        <w:rPr>
+          <w:rFonts w:ascii="Times New Roman" w:cs="Times New Roman" w:eastAsia="Times New Roman" w:hAnsi="Times New Roman"/>
+          <w:sz w:val="24"/>
+          <w:szCs w:val="24"/>
+        </w:rPr>
+        <w:t xml:space="preserve">A purely learned controller is, however, difficult to trust with a safety-critical function such as a traffic signal: a neural network can produce a confident, well-formed, and completely unsafe recommendation (for example, a phase change that skips a mandatory clearance interval, or a hold that starves an approach indefinitely) and nothing in its own training process guarantees that this will never happen. This project's central design decision, discussed throughout this report, is therefore to treat any learned component as advisory only, and to place a small, deterministic, exhaustively-testable rule engine between the model's output and the physical (in this case, simulated) signal head, so that the system's safety properties do not depend on the model behaving correctly.</w:t>
+      </w:r>
+    </w:p>
+    <w:p>
+      <w:pPr>
+        <w:spacing w:after="240" w:line="480" w:lineRule="auto"/>
+        <w:jc w:val="both"/>
+      </w:pPr>
+      <w:r>
+        <w:rPr>
+          <w:rFonts w:ascii="Times New Roman" w:cs="Times New Roman" w:eastAsia="Times New Roman" w:hAnsi="Times New Roman"/>
+          <w:sz w:val="24"/>
+          <w:szCs w:val="24"/>
+        </w:rPr>
+        <w:t xml:space="preserve">This project, named MaHanya, applies this design to a real Nigerian junction, the Sapon Under-bridge Junction in Abeokuta, Ogun State, using it as a calibration case study for a simulation-based intelligent traffic control system built from a microscopic SUMO (Simulation of Urban MObility) simulation, a lightweight Transformer Encoder phase-recommendation model, and a deterministic priority-aware scheduler.</w:t>
       </w:r>
     </w:p>
     <w:p>
@@ -1331,7 +1331,7 @@
           <w:sz w:val="24"/>
           <w:szCs w:val="24"/>
         </w:rPr>
-        <w:t xml:space="preserve">No systematic mechanism for prioritising emergency vehicles — an ambulance or fire truck approaching a fixed-time junction has no faster path through it than any other vehicle, regardless of the urgency of its journey.</w:t>
+        <w:t xml:space="preserve">No systematic mechanism for prioritising emergency vehicles: an ambulance or fire truck approaching a fixed-time junction has no faster path through it than any other vehicle, regardless of the urgency of its journey.</w:t>
       </w:r>
     </w:p>
     <w:p>
@@ -1364,7 +1364,7 @@
           <w:sz w:val="24"/>
           <w:szCs w:val="24"/>
         </w:rPr>
-        <w:t xml:space="preserve">Addressing this through physical infrastructure change — new detector hardware, a new controller cabinet, a wider carriageway — is expensive and impractical for an academic project, and does not, by itself, answer the more interesting question of whether a learned recommender constrained by a deterministic safety layer can out-perform fixed-time control on real junction geometry and real-shaped traffic. A simulation-based approach, calibrated with real traffic-count data and combined with a rule-guided scheduler, offers a rigorous and reproducible way to study this question within a final-year project's scope, without requiring access to physical signal hardware.</w:t>
+        <w:t xml:space="preserve">Addressing this through physical infrastructure change (new detector hardware, a new controller cabinet, a wider carriageway) is expensive and impractical for an academic project, and does not, by itself, answer the more interesting question of whether a learned recommender constrained by a deterministic safety layer can out-perform fixed-time control on real junction geometry and real-shaped traffic. A simulation-based approach, calibrated with real traffic-count data and combined with a rule-guided scheduler, offers a rigorous and reproducible way to study this question within a final-year project's scope, without requiring access to physical signal hardware.</w:t>
       </w:r>
     </w:p>
     <w:p>
@@ -1592,7 +1592,7 @@
           <w:sz w:val="24"/>
           <w:szCs w:val="24"/>
         </w:rPr>
-        <w:t xml:space="preserve">For academic evaluators, this project demonstrates a complete, reproducible pipeline from raw field-count data through to a working, evaluated control system, and shows a specific, defensible pattern — a learned recommender wrapped by a deterministic safety layer — for combining machine learning with a safety-critical control problem, rather than trusting a model's output directly.</w:t>
+        <w:t xml:space="preserve">For academic evaluators, this project demonstrates a complete, reproducible pipeline from raw field-count data through to a working, evaluated control system, and shows a specific, defensible pattern (a learned recommender wrapped by a deterministic safety layer) for combining machine learning with a safety-critical control problem, rather than trusting a model's output directly.</w:t>
       </w:r>
     </w:p>
     <w:p>
@@ -1620,7 +1620,7 @@
           <w:sz w:val="24"/>
           <w:szCs w:val="24"/>
         </w:rPr>
-        <w:t xml:space="preserve">For driver and pedestrian safety reviewers, the project's central contribution is architectural rather than purely predictive: it shows a specific way to let a learned component participate in a safety-critical system — as an advisory recommender, never as the final authority — with every scheduler decision that accepts, holds, or overrides that recommendation logged with an explicit, auditable reason code.</w:t>
+        <w:t xml:space="preserve">For driver and pedestrian safety reviewers, the project's central contribution is architectural rather than purely predictive: it shows a specific way to let a learned component participate in a safety-critical system (as an advisory recommender, never as the final authority) with every scheduler decision that accepts, holds, or overrides that recommendation logged with an explicit, auditable reason code.</w:t>
       </w:r>
     </w:p>
     <w:p>
@@ -1652,7 +1652,7 @@
           <w:sz w:val="24"/>
           <w:szCs w:val="24"/>
         </w:rPr>
-        <w:t xml:space="preserve">This project is scoped to a single, real, four-way junction — the Sapon Under-bridge Junction, Abeokuta — simulated in SUMO and never deployed to physical signal hardware. It covers the full pipeline from field-count data collection through statistical calibration, SUMO scenario construction, sequence generation, model training, a rule-based runtime control loop with emergency pre-emption, evaluation against a fixed-time baseline, and a real-time dashboard for visualising all of the above. It explicitly excludes network-wide, multi-junction optimisation; production or city-wide deployment; and general-purpose traffic-engineering tooling intended for junctions or use cases beyond this one calibration case study.</w:t>
+        <w:t xml:space="preserve">This project is scoped to a single, real, four-way junction, the Sapon Under-bridge Junction, Abeokuta, simulated in SUMO and never deployed to physical signal hardware. It covers the full pipeline from field-count data collection through statistical calibration, SUMO scenario construction, sequence generation, model training, a rule-based runtime control loop with emergency pre-emption, evaluation against a fixed-time baseline, and a real-time dashboard for visualising all of the above. It explicitly excludes network-wide, multi-junction optimisation; production or city-wide deployment; and general-purpose traffic-engineering tooling intended for junctions or use cases beyond this one calibration case study.</w:t>
       </w:r>
     </w:p>
     <w:p>
@@ -1684,7 +1684,7 @@
           <w:sz w:val="24"/>
           <w:szCs w:val="24"/>
         </w:rPr>
-        <w:t xml:space="preserve">Three limitations bound how this project's results should be read. First, the field-count dataset used to calibrate the simulation for this submission is a synthetic placeholder — structured identically to what a real Sapon Under-bridge Junction traffic survey would produce, and designed so that a genuine survey's data can be substituted with a drop-in file replacement and no code changes — rather than data from an actual, executed field survey; the calibration and every downstream result in this report should accordingly be read as validating the pipeline's methodology, not as a claim about the real junction's present-day traffic volumes.</w:t>
+        <w:t xml:space="preserve">Three limitations bound how this project's results should be read. First, the field-count dataset used to calibrate the simulation for this submission is a synthetic placeholder (structured identically to what a real Sapon Under-bridge Junction traffic survey would produce, and designed so that a genuine survey's data can be substituted with a drop-in file replacement and no code changes) rather than data from an actual, executed field survey; the calibration and every downstream result in this report should accordingly be read as validating the pipeline's methodology, not as a claim about the real junction's present-day traffic volumes.</w:t>
       </w:r>
     </w:p>
     <w:p>
@@ -1751,7 +1751,7 @@
           <w:sz w:val="24"/>
           <w:szCs w:val="24"/>
         </w:rPr>
-        <w:t xml:space="preserve">Phase — </w:t>
+        <w:t xml:space="preserve">Phase: </w:t>
       </w:r>
       <w:r>
         <w:rPr>
@@ -1780,7 +1780,7 @@
           <w:sz w:val="24"/>
           <w:szCs w:val="24"/>
         </w:rPr>
-        <w:t xml:space="preserve">Green / yellow / all-red — </w:t>
+        <w:t xml:space="preserve">Green / yellow / all-red: </w:t>
       </w:r>
       <w:r>
         <w:rPr>
@@ -1809,7 +1809,7 @@
           <w:sz w:val="24"/>
           <w:szCs w:val="24"/>
         </w:rPr>
-        <w:t xml:space="preserve">Headway — </w:t>
+        <w:t xml:space="preserve">Headway: </w:t>
       </w:r>
       <w:r>
         <w:rPr>
@@ -1838,7 +1838,7 @@
           <w:sz w:val="24"/>
           <w:szCs w:val="24"/>
         </w:rPr>
-        <w:t xml:space="preserve">Pre-emption — </w:t>
+        <w:t xml:space="preserve">Pre-emption: </w:t>
       </w:r>
       <w:r>
         <w:rPr>
@@ -1867,7 +1867,7 @@
           <w:sz w:val="24"/>
           <w:szCs w:val="24"/>
         </w:rPr>
-        <w:t xml:space="preserve">Anti-starvation — </w:t>
+        <w:t xml:space="preserve">Anti-starvation: </w:t>
       </w:r>
       <w:r>
         <w:rPr>
@@ -1896,7 +1896,7 @@
           <w:sz w:val="24"/>
           <w:szCs w:val="24"/>
         </w:rPr>
-        <w:t xml:space="preserve">Throughput — </w:t>
+        <w:t xml:space="preserve">Throughput: </w:t>
       </w:r>
       <w:r>
         <w:rPr>
@@ -1925,7 +1925,7 @@
           <w:sz w:val="24"/>
           <w:szCs w:val="24"/>
         </w:rPr>
-        <w:t xml:space="preserve">Tick — </w:t>
+        <w:t xml:space="preserve">Tick: </w:t>
       </w:r>
       <w:r>
         <w:rPr>
@@ -1954,7 +1954,7 @@
           <w:sz w:val="24"/>
           <w:szCs w:val="24"/>
         </w:rPr>
-        <w:t xml:space="preserve">Reason code — </w:t>
+        <w:t xml:space="preserve">Reason code: </w:t>
       </w:r>
       <w:r>
         <w:rPr>
@@ -2216,7 +2216,7 @@
           <w:sz w:val="24"/>
           <w:szCs w:val="24"/>
         </w:rPr>
-        <w:t xml:space="preserve">(3), 278–285.</w:t>
+        <w:t xml:space="preserve">(3), 278-285.</w:t>
       </w:r>
     </w:p>
     <w:p>
@@ -2249,7 +2249,7 @@
           <w:sz w:val="24"/>
           <w:szCs w:val="24"/>
         </w:rPr>
-        <w:t xml:space="preserve">(1), 11–32. https://doi.org/10.1109/TITS.2020.3008612</w:t>
+        <w:t xml:space="preserve">(1), 11-32. https://doi.org/10.1109/TITS.2020.3008612</w:t>
       </w:r>
     </w:p>
     <w:p>
@@ -2282,7 +2282,7 @@
           <w:sz w:val="24"/>
           <w:szCs w:val="24"/>
         </w:rPr>
-        <w:t xml:space="preserve">(4), 190–192.</w:t>
+        <w:t xml:space="preserve">(4), 190-192.</w:t>
       </w:r>
     </w:p>
     <w:p>
@@ -2315,7 +2315,7 @@
           <w:sz w:val="24"/>
           <w:szCs w:val="24"/>
         </w:rPr>
-        <w:t xml:space="preserve"> (pp. 2575–2582). IEEE.</w:t>
+        <w:t xml:space="preserve"> (pp. 2575-2582). IEEE.</w:t>
       </w:r>
     </w:p>
     <w:p>
@@ -2348,7 +2348,7 @@
           <w:sz w:val="24"/>
           <w:szCs w:val="24"/>
         </w:rPr>
-        <w:t xml:space="preserve">, 5998–6008.</w:t>
+        <w:t xml:space="preserve">, 5998-6008.</w:t>
       </w:r>
     </w:p>
     <w:p>

</xml_diff>